<commit_message>
final doc, start present
</commit_message>
<xml_diff>
--- a/docs/prezentare/disertatie_prezentare_text.docx
+++ b/docs/prezentare/disertatie_prezentare_text.docx
@@ -10,15 +10,6 @@
           <w:bCs/>
         </w:rPr>
       </w:pPr>
-    </w:p>
-    <w:p>
-      <w:pPr>
-        <w:rPr>
-          <w:rFonts w:cstheme="minorHAnsi"/>
-          <w:b/>
-          <w:bCs/>
-        </w:rPr>
-      </w:pPr>
       <w:r>
         <w:rPr>
           <w:rFonts w:cstheme="minorHAnsi"/>
@@ -36,6 +27,16 @@
           <w:bCs/>
         </w:rPr>
       </w:pPr>
+      <w:r>
+        <w:rPr>
+          <w:rFonts w:cstheme="minorHAnsi"/>
+          <w:b/>
+          <w:bCs/>
+        </w:rPr>
+        <w:pict w14:anchorId="76C1DEA0">
+          <v:rect id="_x0000_i1121" style="width:652.5pt;height:1.5pt" o:hrpct="0" o:hralign="center" o:hrstd="t" o:hr="t" fillcolor="#a0a0a0" stroked="f"/>
+        </w:pict>
+      </w:r>
     </w:p>
     <w:p>
       <w:pPr>
@@ -73,15 +74,10 @@
     </w:p>
     <w:p>
       <w:pPr>
-        <w:rPr>
-          <w:rFonts w:cstheme="minorHAnsi"/>
-          <w:b/>
-          <w:bCs/>
-        </w:rPr>
-      </w:pPr>
-    </w:p>
-    <w:p>
-      <w:pPr>
+        <w:numPr>
+          <w:ilvl w:val="0"/>
+          <w:numId w:val="6"/>
+        </w:numPr>
         <w:rPr>
           <w:rFonts w:cstheme="minorHAnsi"/>
           <w:b/>
@@ -99,6 +95,10 @@
     </w:p>
     <w:p>
       <w:pPr>
+        <w:numPr>
+          <w:ilvl w:val="0"/>
+          <w:numId w:val="6"/>
+        </w:numPr>
         <w:rPr>
           <w:rFonts w:cstheme="minorHAnsi"/>
           <w:b/>
@@ -116,6 +116,10 @@
     </w:p>
     <w:p>
       <w:pPr>
+        <w:numPr>
+          <w:ilvl w:val="0"/>
+          <w:numId w:val="6"/>
+        </w:numPr>
         <w:rPr>
           <w:rFonts w:cstheme="minorHAnsi"/>
           <w:b/>
@@ -133,6 +137,10 @@
     </w:p>
     <w:p>
       <w:pPr>
+        <w:numPr>
+          <w:ilvl w:val="0"/>
+          <w:numId w:val="6"/>
+        </w:numPr>
         <w:rPr>
           <w:rFonts w:cstheme="minorHAnsi"/>
           <w:b/>
@@ -150,6 +158,10 @@
     </w:p>
     <w:p>
       <w:pPr>
+        <w:numPr>
+          <w:ilvl w:val="0"/>
+          <w:numId w:val="6"/>
+        </w:numPr>
         <w:rPr>
           <w:rFonts w:cstheme="minorHAnsi"/>
           <w:b/>
@@ -167,6 +179,10 @@
     </w:p>
     <w:p>
       <w:pPr>
+        <w:numPr>
+          <w:ilvl w:val="0"/>
+          <w:numId w:val="6"/>
+        </w:numPr>
         <w:rPr>
           <w:rFonts w:cstheme="minorHAnsi"/>
           <w:b/>
@@ -184,6 +200,10 @@
     </w:p>
     <w:p>
       <w:pPr>
+        <w:numPr>
+          <w:ilvl w:val="0"/>
+          <w:numId w:val="6"/>
+        </w:numPr>
         <w:rPr>
           <w:rFonts w:cstheme="minorHAnsi"/>
           <w:b/>
@@ -201,6 +221,31 @@
     </w:p>
     <w:p>
       <w:pPr>
+        <w:numPr>
+          <w:ilvl w:val="0"/>
+          <w:numId w:val="6"/>
+        </w:numPr>
+        <w:rPr>
+          <w:rFonts w:cstheme="minorHAnsi"/>
+          <w:b/>
+          <w:bCs/>
+        </w:rPr>
+      </w:pPr>
+      <w:r>
+        <w:rPr>
+          <w:rFonts w:cstheme="minorHAnsi"/>
+          <w:b/>
+          <w:bCs/>
+        </w:rPr>
+        <w:t>Evaluarea comparativă cu protocoalele PAKE: SRP-6a și SPAKE2</w:t>
+      </w:r>
+    </w:p>
+    <w:p>
+      <w:pPr>
+        <w:numPr>
+          <w:ilvl w:val="0"/>
+          <w:numId w:val="6"/>
+        </w:numPr>
         <w:rPr>
           <w:rFonts w:cstheme="minorHAnsi"/>
           <w:b/>
@@ -224,15 +269,16 @@
           <w:bCs/>
         </w:rPr>
       </w:pPr>
-    </w:p>
-    <w:p>
-      <w:pPr>
-        <w:rPr>
-          <w:rFonts w:cstheme="minorHAnsi"/>
-          <w:b/>
-          <w:bCs/>
-        </w:rPr>
-      </w:pPr>
+      <w:r>
+        <w:rPr>
+          <w:rFonts w:cstheme="minorHAnsi"/>
+          <w:b/>
+          <w:bCs/>
+        </w:rPr>
+        <w:pict w14:anchorId="0686AA5F">
+          <v:rect id="_x0000_i1122" style="width:652.5pt;height:1.5pt" o:hrpct="0" o:hralign="center" o:hrstd="t" o:hr="t" fillcolor="#a0a0a0" stroked="f"/>
+        </w:pict>
+      </w:r>
     </w:p>
     <w:p>
       <w:pPr>
@@ -299,17 +345,8 @@
           <w:b/>
           <w:bCs/>
         </w:rPr>
-        <w:t>Scopul este proiectarea unui protocol hibrid care îmbină schema Schnorr, bazată pe demonstrații cu cunoștințe zero, cu cadrul OAuth 2.0, astfel încât parola să nu părăsească niciodată dispozitivul clientului. Au fost implementate și trei fluxuri OAuth clasice ca bază de referință comparativă.</w:t>
-      </w:r>
-    </w:p>
-    <w:p>
-      <w:pPr>
-        <w:rPr>
-          <w:rFonts w:cstheme="minorHAnsi"/>
-          <w:b/>
-          <w:bCs/>
-        </w:rPr>
-      </w:pPr>
+        <w:t>Scopul este proiectarea unui protocol hibrid care îmbină schema Schnorr, bazată pe demonstrații cu cunoștințe zero, cu cadrul OAuth 2.0, astfel încât parola să nu părăsească niciodată dispozitivul clientului. Au fost implementate și trei fluxuri OAuth clasice ca bază de referință comparativă, completate de o evaluare față de protocoalele PAKE consacrate, SRP-6a și SPAKE2.</w:t>
+      </w:r>
     </w:p>
     <w:p>
       <w:pPr>
@@ -376,50 +413,41 @@
           <w:b/>
           <w:bCs/>
         </w:rPr>
+        <w:t>Astfel, protocolul oferă reziliență la interceptare, previne atacurile replay și atenuează impactul breșelor de date, serverul stocând exclusiv chei publice.</w:t>
+      </w:r>
+    </w:p>
+    <w:p>
+      <w:pPr>
+        <w:rPr>
+          <w:rFonts w:cstheme="minorHAnsi"/>
+          <w:b/>
+          <w:bCs/>
+        </w:rPr>
+      </w:pPr>
+      <w:r>
+        <w:rPr>
+          <w:rFonts w:cstheme="minorHAnsi"/>
+          <w:b/>
+          <w:bCs/>
+        </w:rPr>
+        <w:t>Slide 5 (Schema Schnorr)</w:t>
+      </w:r>
+    </w:p>
+    <w:p>
+      <w:pPr>
+        <w:rPr>
+          <w:rFonts w:cstheme="minorHAnsi"/>
+          <w:b/>
+          <w:bCs/>
+        </w:rPr>
+      </w:pPr>
+      <w:r>
+        <w:rPr>
+          <w:rFonts w:cstheme="minorHAnsi"/>
+          <w:b/>
+          <w:bCs/>
+        </w:rPr>
         <w:lastRenderedPageBreak/>
-        <w:t>Astfel, protocolul oferă reziliență la interceptare, previne atacurile replay și atenuează impactul breșelor de date, serverul stocând exclusiv chei publice.</w:t>
-      </w:r>
-    </w:p>
-    <w:p>
-      <w:pPr>
-        <w:rPr>
-          <w:rFonts w:cstheme="minorHAnsi"/>
-          <w:b/>
-          <w:bCs/>
-        </w:rPr>
-      </w:pPr>
-    </w:p>
-    <w:p>
-      <w:pPr>
-        <w:rPr>
-          <w:rFonts w:cstheme="minorHAnsi"/>
-          <w:b/>
-          <w:bCs/>
-        </w:rPr>
-      </w:pPr>
-      <w:r>
-        <w:rPr>
-          <w:rFonts w:cstheme="minorHAnsi"/>
-          <w:b/>
-          <w:bCs/>
-        </w:rPr>
-        <w:t>Slide 5 (Schema Schnorr)</w:t>
-      </w:r>
-    </w:p>
-    <w:p>
-      <w:pPr>
-        <w:rPr>
-          <w:rFonts w:cstheme="minorHAnsi"/>
-          <w:b/>
-          <w:bCs/>
-        </w:rPr>
-      </w:pPr>
-      <w:r>
-        <w:rPr>
-          <w:rFonts w:cstheme="minorHAnsi"/>
-          <w:b/>
-          <w:bCs/>
-        </w:rPr>
         <w:t>Schema Schnorr se fundamentează pe dificultatea problemei logaritmului discret. Se utilizează un număr prim sigur P, un generator G al subgrupului de ordin Q, iar protocolul parcurge patru etape: generarea cheilor, unde cheia publică y = G^x mod P este stocată de server; angajamentul, unde clientul transmite t = G^r mod P; provocarea, unde serverul generează aleatoriu c; și răspunsul, unde clientul calculează s = (r + c * x) mod Q.</w:t>
       </w:r>
     </w:p>
@@ -448,15 +476,6 @@
           <w:bCs/>
         </w:rPr>
       </w:pPr>
-    </w:p>
-    <w:p>
-      <w:pPr>
-        <w:rPr>
-          <w:rFonts w:cstheme="minorHAnsi"/>
-          <w:b/>
-          <w:bCs/>
-        </w:rPr>
-      </w:pPr>
       <w:r>
         <w:rPr>
           <w:rFonts w:cstheme="minorHAnsi"/>
@@ -508,15 +527,6 @@
           <w:bCs/>
         </w:rPr>
       </w:pPr>
-    </w:p>
-    <w:p>
-      <w:pPr>
-        <w:rPr>
-          <w:rFonts w:cstheme="minorHAnsi"/>
-          <w:b/>
-          <w:bCs/>
-        </w:rPr>
-      </w:pPr>
       <w:r>
         <w:rPr>
           <w:rFonts w:cstheme="minorHAnsi"/>
@@ -585,15 +595,6 @@
           <w:bCs/>
         </w:rPr>
       </w:pPr>
-    </w:p>
-    <w:p>
-      <w:pPr>
-        <w:rPr>
-          <w:rFonts w:cstheme="minorHAnsi"/>
-          <w:b/>
-          <w:bCs/>
-        </w:rPr>
-      </w:pPr>
       <w:r>
         <w:rPr>
           <w:rFonts w:cstheme="minorHAnsi"/>
@@ -662,15 +663,6 @@
           <w:bCs/>
         </w:rPr>
       </w:pPr>
-    </w:p>
-    <w:p>
-      <w:pPr>
-        <w:rPr>
-          <w:rFonts w:cstheme="minorHAnsi"/>
-          <w:b/>
-          <w:bCs/>
-        </w:rPr>
-      </w:pPr>
       <w:r>
         <w:rPr>
           <w:rFonts w:cstheme="minorHAnsi"/>
@@ -722,15 +714,6 @@
           <w:bCs/>
         </w:rPr>
       </w:pPr>
-    </w:p>
-    <w:p>
-      <w:pPr>
-        <w:rPr>
-          <w:rFonts w:cstheme="minorHAnsi"/>
-          <w:b/>
-          <w:bCs/>
-        </w:rPr>
-      </w:pPr>
       <w:r>
         <w:rPr>
           <w:rFonts w:cstheme="minorHAnsi"/>
@@ -754,6 +737,7 @@
           <w:b/>
           <w:bCs/>
         </w:rPr>
+        <w:lastRenderedPageBreak/>
         <w:t>Clientul generează un nonce aleatoriu, calculează angajamentul t și îl transmite. Serverul creează o sesiune temporară cu un timp de viață de 5 secunde și returnează provocarea aleatorie c.</w:t>
       </w:r>
     </w:p>
@@ -782,15 +766,6 @@
           <w:bCs/>
         </w:rPr>
       </w:pPr>
-    </w:p>
-    <w:p>
-      <w:pPr>
-        <w:rPr>
-          <w:rFonts w:cstheme="minorHAnsi"/>
-          <w:b/>
-          <w:bCs/>
-        </w:rPr>
-      </w:pPr>
       <w:r>
         <w:rPr>
           <w:rFonts w:cstheme="minorHAnsi"/>
@@ -859,15 +834,6 @@
           <w:bCs/>
         </w:rPr>
       </w:pPr>
-    </w:p>
-    <w:p>
-      <w:pPr>
-        <w:rPr>
-          <w:rFonts w:cstheme="minorHAnsi"/>
-          <w:b/>
-          <w:bCs/>
-        </w:rPr>
-      </w:pPr>
       <w:r>
         <w:rPr>
           <w:rFonts w:cstheme="minorHAnsi"/>
@@ -908,17 +874,8 @@
           <w:b/>
           <w:bCs/>
         </w:rPr>
-        <w:t>Auditul de trafic a confirmat că niciun mesaj HTTP nu conține parola brută sau derivate directe. Atacurile simulate de tip replay, session hijacking, compromitere de date și simulator attacks au fost respinse cu succes.</w:t>
-      </w:r>
-    </w:p>
-    <w:p>
-      <w:pPr>
-        <w:rPr>
-          <w:rFonts w:cstheme="minorHAnsi"/>
-          <w:b/>
-          <w:bCs/>
-        </w:rPr>
-      </w:pPr>
+        <w:t>Auditul de trafic a confirmat că niciun mesaj HTTP nu conține parola brută sau derivate directe. Atacurile simulate de tip replay, session hijacking, compromitere de date și simulator attack au fost respinse cu succes.</w:t>
+      </w:r>
     </w:p>
     <w:p>
       <w:pPr>
@@ -951,171 +908,229 @@
           <w:b/>
           <w:bCs/>
         </w:rPr>
+        <w:t>Evaluările au indicat o latență a verificării criptografice de aproximativ 1,12 milisecunde per operație și un debit susținut de circa 170 de cereri pe secundă. Compromisul temporal față de schemele clasice este justificat de garanțiile criptografice superioare obținute.</w:t>
+      </w:r>
+    </w:p>
+    <w:p>
+      <w:pPr>
+        <w:rPr>
+          <w:rFonts w:cstheme="minorHAnsi"/>
+          <w:b/>
+          <w:bCs/>
+        </w:rPr>
+      </w:pPr>
+      <w:r>
+        <w:rPr>
+          <w:rFonts w:cstheme="minorHAnsi"/>
+          <w:b/>
+          <w:bCs/>
+        </w:rPr>
+        <w:t>Protocolul se încadrează în parametrii optimi pentru autentificarea interactivă, latența totală rămânând imperceptibilă pentru utilizatorul final.</w:t>
+      </w:r>
+    </w:p>
+    <w:p>
+      <w:pPr>
+        <w:rPr>
+          <w:rFonts w:cstheme="minorHAnsi"/>
+          <w:b/>
+          <w:bCs/>
+        </w:rPr>
+      </w:pPr>
+      <w:r>
+        <w:rPr>
+          <w:rFonts w:cstheme="minorHAnsi"/>
+          <w:b/>
+          <w:bCs/>
+        </w:rPr>
+        <w:t>Slide 14 (Comparație ZKP vs. OAuth 2.0)</w:t>
+      </w:r>
+    </w:p>
+    <w:p>
+      <w:pPr>
+        <w:rPr>
+          <w:rFonts w:cstheme="minorHAnsi"/>
+          <w:b/>
+          <w:bCs/>
+        </w:rPr>
+      </w:pPr>
+      <w:r>
+        <w:rPr>
+          <w:rFonts w:cstheme="minorHAnsi"/>
+          <w:b/>
+          <w:bCs/>
+        </w:rPr>
+        <w:t>În protocolul ZKP Schnorr, secretul nu traversează niciodată rețeaua. În fluxurile OAuth PKCE, simplificat și Authlib, parola este transmisă în faza de autentificare, chiar dacă restul fluxului beneficiază de protecție.</w:t>
+      </w:r>
+    </w:p>
+    <w:p>
+      <w:pPr>
+        <w:rPr>
+          <w:rFonts w:cstheme="minorHAnsi"/>
+          <w:b/>
+          <w:bCs/>
+        </w:rPr>
+      </w:pPr>
+      <w:r>
+        <w:rPr>
+          <w:rFonts w:cstheme="minorHAnsi"/>
+          <w:b/>
+          <w:bCs/>
+        </w:rPr>
+        <w:t>Din perspectiva costurilor, fluxul ZKP introduce o latență ușor superioară, însă acest compromis este justificat de eliminarea completă a riscului de exfiltrare a parolei.</w:t>
+      </w:r>
+    </w:p>
+    <w:p>
+      <w:pPr>
+        <w:rPr>
+          <w:rFonts w:cstheme="minorHAnsi"/>
+          <w:b/>
+          <w:bCs/>
+        </w:rPr>
+      </w:pPr>
+      <w:r>
+        <w:rPr>
+          <w:rFonts w:cstheme="minorHAnsi"/>
+          <w:b/>
+          <w:bCs/>
+        </w:rPr>
+        <w:t>Slide 15 (Comparație cu protocoalele PAKE: SRP-6a și SPAKE2)</w:t>
+      </w:r>
+    </w:p>
+    <w:p>
+      <w:pPr>
+        <w:rPr>
+          <w:rFonts w:cstheme="minorHAnsi"/>
+          <w:b/>
+          <w:bCs/>
+        </w:rPr>
+      </w:pPr>
+      <w:r>
+        <w:rPr>
+          <w:rFonts w:cstheme="minorHAnsi"/>
+          <w:b/>
+          <w:bCs/>
+        </w:rPr>
+        <w:t>Deoarece o comparație directă între protocolul ZKP și fluxurile OAuth 2.0 nu reflectă cu fidelitate poziționarea soluției în peisajul protocoalelor fără divulgare a secretului, s-a realizat o evaluare complementară față de două protocoale PAKE consacrate: SRP-6a, standardizat prin RFC 5054, și SPAKE2, bazat pe curba Ed25519.</w:t>
+      </w:r>
+    </w:p>
+    <w:p>
+      <w:pPr>
+        <w:rPr>
+          <w:rFonts w:cstheme="minorHAnsi"/>
+          <w:b/>
+          <w:bCs/>
+        </w:rPr>
+      </w:pPr>
+      <w:r>
+        <w:rPr>
+          <w:rFonts w:cstheme="minorHAnsi"/>
+          <w:b/>
+          <w:bCs/>
+        </w:rPr>
         <w:lastRenderedPageBreak/>
-        <w:t>Evaluările au indicat o latență a verificării criptografice de aproximativ 1,12 milisecunde per operație și un debit susținut de circa 170 de cereri pe secundă. Compromisul temporal față de schemele clasice este justificat de garanțiile criptografice superioare obținute.</w:t>
-      </w:r>
-    </w:p>
-    <w:p>
-      <w:pPr>
-        <w:rPr>
-          <w:rFonts w:cstheme="minorHAnsi"/>
-          <w:b/>
-          <w:bCs/>
-        </w:rPr>
-      </w:pPr>
-      <w:r>
-        <w:rPr>
-          <w:rFonts w:cstheme="minorHAnsi"/>
-          <w:b/>
-          <w:bCs/>
-        </w:rPr>
-        <w:t>Protocolul se încadrează în parametrii optimi pentru autentificarea interactivă, latența totală rămânând imperceptibilă pentru utilizatorul final.</w:t>
-      </w:r>
-    </w:p>
-    <w:p>
-      <w:pPr>
-        <w:rPr>
-          <w:rFonts w:cstheme="minorHAnsi"/>
-          <w:b/>
-          <w:bCs/>
-        </w:rPr>
-      </w:pPr>
-    </w:p>
-    <w:p>
-      <w:pPr>
-        <w:rPr>
-          <w:rFonts w:cstheme="minorHAnsi"/>
-          <w:b/>
-          <w:bCs/>
-        </w:rPr>
-      </w:pPr>
-      <w:r>
-        <w:rPr>
-          <w:rFonts w:cstheme="minorHAnsi"/>
-          <w:b/>
-          <w:bCs/>
-        </w:rPr>
-        <w:t>Slide 14 (Comparație ZKP vs. OAuth 2.0)</w:t>
-      </w:r>
-    </w:p>
-    <w:p>
-      <w:pPr>
-        <w:rPr>
-          <w:rFonts w:cstheme="minorHAnsi"/>
-          <w:b/>
-          <w:bCs/>
-        </w:rPr>
-      </w:pPr>
-      <w:r>
-        <w:rPr>
-          <w:rFonts w:cstheme="minorHAnsi"/>
-          <w:b/>
-          <w:bCs/>
-        </w:rPr>
-        <w:t>În protocolul ZKP Schnorr, secretul nu traversează niciodată rețeaua. În fluxurile OAuth PKCE, simplificat și Authlib, parola este transmisă în faza de autentificare, chiar dacă restul fluxului beneficiază de protecție.</w:t>
-      </w:r>
-    </w:p>
-    <w:p>
-      <w:pPr>
-        <w:rPr>
-          <w:rFonts w:cstheme="minorHAnsi"/>
-          <w:b/>
-          <w:bCs/>
-        </w:rPr>
-      </w:pPr>
-      <w:r>
-        <w:rPr>
-          <w:rFonts w:cstheme="minorHAnsi"/>
-          <w:b/>
-          <w:bCs/>
-        </w:rPr>
-        <w:t>Din perspectiva costurilor, fluxul ZKP introduce o latență ușor superioară, însă acest compromis este justificat de eliminarea completă a riscului de exfiltrare a parolei.</w:t>
-      </w:r>
-    </w:p>
-    <w:p>
-      <w:pPr>
-        <w:rPr>
-          <w:rFonts w:cstheme="minorHAnsi"/>
-          <w:b/>
-          <w:bCs/>
-        </w:rPr>
-      </w:pPr>
-    </w:p>
-    <w:p>
-      <w:pPr>
-        <w:rPr>
-          <w:rFonts w:cstheme="minorHAnsi"/>
-          <w:b/>
-          <w:bCs/>
-        </w:rPr>
-      </w:pPr>
-      <w:r>
-        <w:rPr>
-          <w:rFonts w:cstheme="minorHAnsi"/>
-          <w:b/>
-          <w:bCs/>
-        </w:rPr>
-        <w:t>Slide 15 (Concluzii)</w:t>
-      </w:r>
-    </w:p>
-    <w:p>
-      <w:pPr>
-        <w:rPr>
-          <w:rFonts w:cstheme="minorHAnsi"/>
-          <w:b/>
-          <w:bCs/>
-        </w:rPr>
-      </w:pPr>
-      <w:r>
-        <w:rPr>
-          <w:rFonts w:cstheme="minorHAnsi"/>
-          <w:b/>
-          <w:bCs/>
-        </w:rPr>
-        <w:t>Implementarea demonstrează viabilitatea autentificării web fără transmiterea parolei către server. Protocolul satisface rigorile funcționale, de securitate și de performanță, iar integrarea în ecosistemul OAuth confirmă compatibilitatea cu standardele existente.</w:t>
-      </w:r>
-    </w:p>
-    <w:p>
-      <w:pPr>
-        <w:rPr>
-          <w:rFonts w:cstheme="minorHAnsi"/>
-          <w:b/>
-          <w:bCs/>
-        </w:rPr>
-      </w:pPr>
-      <w:r>
-        <w:rPr>
-          <w:rFonts w:cstheme="minorHAnsi"/>
-          <w:b/>
-          <w:bCs/>
-        </w:rPr>
-        <w:t>Ca limitări, parametrii actuali, precum G = 4 și scrypt n = 2^11, sunt adecvați exclusiv prototipului. Ca direcții viitoare, se impune tranziția către curbe eliptice, derivarea cheilor prin Argon2, externalizarea sesiunilor către Redis, semnături asimetrice pentru jetoane și implementarea obligatorie a HTTPS.</w:t>
-      </w:r>
-    </w:p>
-    <w:p>
-      <w:pPr>
-        <w:rPr>
-          <w:rFonts w:cstheme="minorHAnsi"/>
-          <w:b/>
-          <w:bCs/>
-        </w:rPr>
-      </w:pPr>
-    </w:p>
-    <w:p>
-      <w:pPr>
-        <w:rPr>
-          <w:rFonts w:cstheme="minorHAnsi"/>
-          <w:b/>
-          <w:bCs/>
-        </w:rPr>
-      </w:pPr>
-      <w:r>
-        <w:rPr>
-          <w:rFonts w:cstheme="minorHAnsi"/>
-          <w:b/>
-          <w:bCs/>
-        </w:rPr>
-        <w:t>Slide 16 (Bibliografie selectivă)</w:t>
+        <w:t>Pentru echitatea comparației, implementarea Schnorr a fost adaptată: operațiile au fost migrate pe curba eliptică secp256r1, protocolul a fost extins cu verificare mutuală și derivarea unei chei de sesiune prin ECDH.</w:t>
+      </w:r>
+    </w:p>
+    <w:p>
+      <w:pPr>
+        <w:rPr>
+          <w:rFonts w:cstheme="minorHAnsi"/>
+          <w:b/>
+          <w:bCs/>
+        </w:rPr>
+      </w:pPr>
+      <w:r>
+        <w:rPr>
+          <w:rFonts w:cstheme="minorHAnsi"/>
+          <w:b/>
+          <w:bCs/>
+        </w:rPr>
+        <w:t>Rezultatele pe 100 de iterații indică: SPAKE2 înregistrează cea mai redusă latență totală, 13,55 milisecunde, beneficiind de absența unei etape distincte de înregistrare. SRP-6a prezintă costul cel mai ridicat, 42,27 milisecunde, dominat de exponențierile pe grupul de 2048 de biți. Schnorr-EC se poziționează intermediar, cu 38,09 milisecunde. Varianta Schnorr-EC-C-Lib, care delegă operațiile pe curbe eliptice unei biblioteci native în C, înregistrează cea mai redusă latență totală dintre toate protocoalele evaluate, 10,655 milisecunde, confirmând că migrarea primitivelor criptografice către implementări compilate elimină supraîncărcarea interpretorului și poziționează schema Schnorr ca alternativă competitivă condiționat de utilizarea unor biblioteci optimizate la nivel nativ.</w:t>
+      </w:r>
+    </w:p>
+    <w:p>
+      <w:pPr>
+        <w:rPr>
+          <w:rFonts w:cstheme="minorHAnsi"/>
+          <w:b/>
+          <w:bCs/>
+        </w:rPr>
+      </w:pPr>
+      <w:r>
+        <w:rPr>
+          <w:rFonts w:cstheme="minorHAnsi"/>
+          <w:b/>
+          <w:bCs/>
+        </w:rPr>
+        <w:t>Din punct de vedere al proprietăților, toate cele trei protocoale asigură autentificare mutuală, derivarea unei chei de sesiune și netransmiterea parolei prin rețea. SRP-6a și SPAKE2 oferă suplimentar rezistență la compromiterea bazei de date, proprietate pe care varianta Schnorr curentă nu o implementează nativ, aceasta constituind o direcție prioritară de dezvoltare. Ca nivel de securitate, SRP-6a operează la aproximativ 112 biți, în timp ce SPAKE2 și Schnorr-EC ating 128 de biți.</w:t>
+      </w:r>
+    </w:p>
+    <w:p>
+      <w:pPr>
+        <w:rPr>
+          <w:rFonts w:cstheme="minorHAnsi"/>
+          <w:b/>
+          <w:bCs/>
+        </w:rPr>
+      </w:pPr>
+      <w:r>
+        <w:rPr>
+          <w:rFonts w:cstheme="minorHAnsi"/>
+          <w:b/>
+          <w:bCs/>
+        </w:rPr>
+        <w:t>Slide 16 (Concluzii)</w:t>
+      </w:r>
+    </w:p>
+    <w:p>
+      <w:pPr>
+        <w:rPr>
+          <w:rFonts w:cstheme="minorHAnsi"/>
+          <w:b/>
+          <w:bCs/>
+        </w:rPr>
+      </w:pPr>
+      <w:r>
+        <w:rPr>
+          <w:rFonts w:cstheme="minorHAnsi"/>
+          <w:b/>
+          <w:bCs/>
+        </w:rPr>
+        <w:t>Implementarea demonstrează viabilitatea autentificării web fără transmiterea parolei către server. Protocolul satisface rigorile funcționale, de securitate și de performanță, iar integrarea în ecosistemul OAuth confirmă compatibilitatea cu standardele existente. Evaluarea comparativă cu SRP-6a și SPAKE2 poziționează soluția într-o zonă intermediară de performanță, confirmând competitivitatea sa cu protocoalele PAKE consacrate.</w:t>
+      </w:r>
+    </w:p>
+    <w:p>
+      <w:pPr>
+        <w:rPr>
+          <w:rFonts w:cstheme="minorHAnsi"/>
+          <w:b/>
+          <w:bCs/>
+        </w:rPr>
+      </w:pPr>
+      <w:r>
+        <w:rPr>
+          <w:rFonts w:cstheme="minorHAnsi"/>
+          <w:b/>
+          <w:bCs/>
+        </w:rPr>
+        <w:t>Ca limitări, parametrii actuali, precum G = 4 și scrypt n = 2^11, sunt adecvați exclusiv prototipului. Ca direcții viitoare, se impun tranziția către curbe eliptice, derivarea cheilor prin Argon2, externalizarea sesiunilor către Redis, semnături asimetrice pentru jetoane și implementarea obligatorie a HTTPS.</w:t>
+      </w:r>
+    </w:p>
+    <w:p>
+      <w:pPr>
+        <w:rPr>
+          <w:rFonts w:cstheme="minorHAnsi"/>
+          <w:b/>
+          <w:bCs/>
+        </w:rPr>
+      </w:pPr>
+      <w:r>
+        <w:rPr>
+          <w:rFonts w:cstheme="minorHAnsi"/>
+          <w:b/>
+          <w:bCs/>
+        </w:rPr>
+        <w:t>Slide 17 (Bibliografie selectivă)</w:t>
       </w:r>
     </w:p>
     <w:p>
@@ -1143,22 +1158,13 @@
           <w:bCs/>
         </w:rPr>
       </w:pPr>
-    </w:p>
-    <w:p>
-      <w:pPr>
-        <w:rPr>
-          <w:rFonts w:cstheme="minorHAnsi"/>
-          <w:b/>
-          <w:bCs/>
-        </w:rPr>
-      </w:pPr>
-      <w:r>
-        <w:rPr>
-          <w:rFonts w:cstheme="minorHAnsi"/>
-          <w:b/>
-          <w:bCs/>
-        </w:rPr>
-        <w:t>Slide 17 (Mulțumesc)</w:t>
+      <w:r>
+        <w:rPr>
+          <w:rFonts w:cstheme="minorHAnsi"/>
+          <w:b/>
+          <w:bCs/>
+        </w:rPr>
+        <w:t>Slide 18 (Mulțumesc)</w:t>
       </w:r>
     </w:p>
     <w:p>
@@ -1178,25 +1184,7 @@
         <w:t>Vă mulțumesc pentru atenție!</w:t>
       </w:r>
     </w:p>
-    <w:p>
-      <w:pPr>
-        <w:rPr>
-          <w:rFonts w:cstheme="minorHAnsi"/>
-          <w:b/>
-          <w:bCs/>
-        </w:rPr>
-      </w:pPr>
-    </w:p>
-    <w:p>
-      <w:r>
-        <w:rPr>
-          <w:rFonts w:cstheme="minorHAnsi"/>
-          <w:b/>
-          <w:bCs/>
-        </w:rPr>
-        <w:t>Textul total este de aproximativ 1100 de cuvinte, calibrat similar cu template-ul de licență (aproximativ 1000-1200 cuvinte), potrivit pentru o susținere de 8-10 minute la un ritm normal de vorbire.</w:t>
-      </w:r>
-    </w:p>
+    <w:p/>
     <w:sectPr>
       <w:footerReference w:type="even" r:id="rId7"/>
       <w:footerReference w:type="default" r:id="rId8"/>
@@ -2314,6 +2302,155 @@
       </w:rPr>
     </w:lvl>
   </w:abstractNum>
+  <w:abstractNum w:abstractNumId="5" w15:restartNumberingAfterBreak="0">
+    <w:nsid w:val="66575A65"/>
+    <w:multiLevelType w:val="multilevel"/>
+    <w:tmpl w:val="5FE06B06"/>
+    <w:lvl w:ilvl="0">
+      <w:start w:val="1"/>
+      <w:numFmt w:val="bullet"/>
+      <w:lvlText w:val=""/>
+      <w:lvlJc w:val="left"/>
+      <w:pPr>
+        <w:tabs>
+          <w:tab w:val="num" w:pos="720"/>
+        </w:tabs>
+        <w:ind w:left="720" w:hanging="360"/>
+      </w:pPr>
+      <w:rPr>
+        <w:rFonts w:ascii="Symbol" w:hAnsi="Symbol" w:hint="default"/>
+        <w:sz w:val="20"/>
+      </w:rPr>
+    </w:lvl>
+    <w:lvl w:ilvl="1" w:tentative="1">
+      <w:start w:val="1"/>
+      <w:numFmt w:val="bullet"/>
+      <w:lvlText w:val="o"/>
+      <w:lvlJc w:val="left"/>
+      <w:pPr>
+        <w:tabs>
+          <w:tab w:val="num" w:pos="1440"/>
+        </w:tabs>
+        <w:ind w:left="1440" w:hanging="360"/>
+      </w:pPr>
+      <w:rPr>
+        <w:rFonts w:ascii="Courier New" w:hAnsi="Courier New" w:hint="default"/>
+        <w:sz w:val="20"/>
+      </w:rPr>
+    </w:lvl>
+    <w:lvl w:ilvl="2" w:tentative="1">
+      <w:start w:val="1"/>
+      <w:numFmt w:val="bullet"/>
+      <w:lvlText w:val=""/>
+      <w:lvlJc w:val="left"/>
+      <w:pPr>
+        <w:tabs>
+          <w:tab w:val="num" w:pos="2160"/>
+        </w:tabs>
+        <w:ind w:left="2160" w:hanging="360"/>
+      </w:pPr>
+      <w:rPr>
+        <w:rFonts w:ascii="Wingdings" w:hAnsi="Wingdings" w:hint="default"/>
+        <w:sz w:val="20"/>
+      </w:rPr>
+    </w:lvl>
+    <w:lvl w:ilvl="3" w:tentative="1">
+      <w:start w:val="1"/>
+      <w:numFmt w:val="bullet"/>
+      <w:lvlText w:val=""/>
+      <w:lvlJc w:val="left"/>
+      <w:pPr>
+        <w:tabs>
+          <w:tab w:val="num" w:pos="2880"/>
+        </w:tabs>
+        <w:ind w:left="2880" w:hanging="360"/>
+      </w:pPr>
+      <w:rPr>
+        <w:rFonts w:ascii="Wingdings" w:hAnsi="Wingdings" w:hint="default"/>
+        <w:sz w:val="20"/>
+      </w:rPr>
+    </w:lvl>
+    <w:lvl w:ilvl="4" w:tentative="1">
+      <w:start w:val="1"/>
+      <w:numFmt w:val="bullet"/>
+      <w:lvlText w:val=""/>
+      <w:lvlJc w:val="left"/>
+      <w:pPr>
+        <w:tabs>
+          <w:tab w:val="num" w:pos="3600"/>
+        </w:tabs>
+        <w:ind w:left="3600" w:hanging="360"/>
+      </w:pPr>
+      <w:rPr>
+        <w:rFonts w:ascii="Wingdings" w:hAnsi="Wingdings" w:hint="default"/>
+        <w:sz w:val="20"/>
+      </w:rPr>
+    </w:lvl>
+    <w:lvl w:ilvl="5" w:tentative="1">
+      <w:start w:val="1"/>
+      <w:numFmt w:val="bullet"/>
+      <w:lvlText w:val=""/>
+      <w:lvlJc w:val="left"/>
+      <w:pPr>
+        <w:tabs>
+          <w:tab w:val="num" w:pos="4320"/>
+        </w:tabs>
+        <w:ind w:left="4320" w:hanging="360"/>
+      </w:pPr>
+      <w:rPr>
+        <w:rFonts w:ascii="Wingdings" w:hAnsi="Wingdings" w:hint="default"/>
+        <w:sz w:val="20"/>
+      </w:rPr>
+    </w:lvl>
+    <w:lvl w:ilvl="6" w:tentative="1">
+      <w:start w:val="1"/>
+      <w:numFmt w:val="bullet"/>
+      <w:lvlText w:val=""/>
+      <w:lvlJc w:val="left"/>
+      <w:pPr>
+        <w:tabs>
+          <w:tab w:val="num" w:pos="5040"/>
+        </w:tabs>
+        <w:ind w:left="5040" w:hanging="360"/>
+      </w:pPr>
+      <w:rPr>
+        <w:rFonts w:ascii="Wingdings" w:hAnsi="Wingdings" w:hint="default"/>
+        <w:sz w:val="20"/>
+      </w:rPr>
+    </w:lvl>
+    <w:lvl w:ilvl="7" w:tentative="1">
+      <w:start w:val="1"/>
+      <w:numFmt w:val="bullet"/>
+      <w:lvlText w:val=""/>
+      <w:lvlJc w:val="left"/>
+      <w:pPr>
+        <w:tabs>
+          <w:tab w:val="num" w:pos="5760"/>
+        </w:tabs>
+        <w:ind w:left="5760" w:hanging="360"/>
+      </w:pPr>
+      <w:rPr>
+        <w:rFonts w:ascii="Wingdings" w:hAnsi="Wingdings" w:hint="default"/>
+        <w:sz w:val="20"/>
+      </w:rPr>
+    </w:lvl>
+    <w:lvl w:ilvl="8" w:tentative="1">
+      <w:start w:val="1"/>
+      <w:numFmt w:val="bullet"/>
+      <w:lvlText w:val=""/>
+      <w:lvlJc w:val="left"/>
+      <w:pPr>
+        <w:tabs>
+          <w:tab w:val="num" w:pos="6480"/>
+        </w:tabs>
+        <w:ind w:left="6480" w:hanging="360"/>
+      </w:pPr>
+      <w:rPr>
+        <w:rFonts w:ascii="Wingdings" w:hAnsi="Wingdings" w:hint="default"/>
+        <w:sz w:val="20"/>
+      </w:rPr>
+    </w:lvl>
+  </w:abstractNum>
   <w:num w:numId="1" w16cid:durableId="77336496">
     <w:abstractNumId w:val="0"/>
   </w:num>
@@ -2328,6 +2465,9 @@
   </w:num>
   <w:num w:numId="5" w16cid:durableId="315574635">
     <w:abstractNumId w:val="3"/>
+  </w:num>
+  <w:num w:numId="6" w16cid:durableId="442191803">
+    <w:abstractNumId w:val="5"/>
   </w:num>
 </w:numbering>
 </file>
@@ -2736,7 +2876,6 @@
   <w:style w:type="character" w:default="1" w:styleId="DefaultParagraphFont">
     <w:name w:val="Default Paragraph Font"/>
     <w:uiPriority w:val="1"/>
-    <w:semiHidden/>
     <w:unhideWhenUsed/>
   </w:style>
   <w:style w:type="table" w:default="1" w:styleId="TableNormal">

</xml_diff>